<commit_message>
Update the resume files to 29 patents, none pending
The site now says 29 granted and no pending applications; the Word and
PDF resumes offered for download still said "20 US Patents (plus 5
others pending)". Both now read "29 US Patents".

The .docx was edited in place -- adjacent identically-formatted runs were
coalesced first so the sentence existed as one findable string -- and the
PDF was re-exported from it with Word, the same producer that generated
the original. Verified: paragraph count unchanged at 48, schema
validation passes, both PDFs are 2 pages, and a word-level diff of the
extracted text shows only the intended change (the remaining diffs are
extraction artifacts that appear in both directions).

Co-Authored-By: Claude Opus 5 <noreply@anthropic.com>
</commit_message>
<xml_diff>
--- a/pubs/FrancoisCharettePhD_Resume.docx
+++ b/pubs/FrancoisCharettePhD_Resume.docx
@@ -16,25 +16,7 @@
           <w:sz w:val="56"/>
           <w:lang w:val="fr-CA"/>
         </w:rPr>
-        <w:t xml:space="preserve">François Charette, </w:t>
-      </w:r>
-      <w:r>
-        <w:rPr>
-          <w:b/>
-          <w:bCs/>
-          <w:sz w:val="56"/>
-          <w:lang w:val="fr-CA"/>
-        </w:rPr>
-        <w:t>PhD</w:t>
-      </w:r>
-      <w:r>
-        <w:rPr>
-          <w:b/>
-          <w:bCs/>
-          <w:sz w:val="56"/>
-          <w:lang w:val="fr-CA"/>
-        </w:rPr>
-        <w:t>.</w:t>
+        <w:t xml:space="preserve">François Charette, PhD.</w:t>
       </w:r>
     </w:p>
     <w:p>
@@ -53,112 +35,25 @@
           <w:lang w:val="fr-CA"/>
         </w:rPr>
         <w:t>849 Avalon Avenue</w:t>
-      </w:r>
-      <w:r>
+        <w:tab/>
+        <w:t xml:space="preserve">Mobile: (209) 972-1220</w:t>
+      </w:r>
+    </w:p>
+    <w:p>
+      <w:pPr>
+        <w:tabs>
+          <w:tab w:val="right" w:pos="11070"/>
+        </w:tabs>
         <w:rPr>
           <w:sz w:val="20"/>
-          <w:lang w:val="fr-CA"/>
-        </w:rPr>
+        </w:rPr>
+      </w:pPr>
+      <w:r>
+        <w:rPr>
+          <w:sz w:val="20"/>
+        </w:rPr>
+        <w:t xml:space="preserve">Lake Havasu City, AZ, 86404</w:t>
         <w:tab/>
-      </w:r>
-      <w:r>
-        <w:rPr>
-          <w:sz w:val="20"/>
-          <w:lang w:val="fr-CA"/>
-        </w:rPr>
-        <w:t>Mobile: (</w:t>
-      </w:r>
-      <w:r>
-        <w:rPr>
-          <w:sz w:val="20"/>
-          <w:lang w:val="fr-CA"/>
-        </w:rPr>
-        <w:t>209</w:t>
-      </w:r>
-      <w:r>
-        <w:rPr>
-          <w:sz w:val="20"/>
-          <w:lang w:val="fr-CA"/>
-        </w:rPr>
-        <w:t xml:space="preserve">) </w:t>
-      </w:r>
-      <w:r>
-        <w:rPr>
-          <w:sz w:val="20"/>
-          <w:lang w:val="fr-CA"/>
-        </w:rPr>
-        <w:t>972</w:t>
-      </w:r>
-      <w:r>
-        <w:rPr>
-          <w:sz w:val="20"/>
-          <w:lang w:val="fr-CA"/>
-        </w:rPr>
-        <w:t>-</w:t>
-      </w:r>
-      <w:r>
-        <w:rPr>
-          <w:sz w:val="20"/>
-          <w:lang w:val="fr-CA"/>
-        </w:rPr>
-        <w:t>1220</w:t>
-      </w:r>
-    </w:p>
-    <w:p>
-      <w:pPr>
-        <w:tabs>
-          <w:tab w:val="right" w:pos="11070"/>
-        </w:tabs>
-        <w:rPr>
-          <w:sz w:val="20"/>
-        </w:rPr>
-      </w:pPr>
-      <w:r>
-        <w:rPr>
-          <w:sz w:val="20"/>
-        </w:rPr>
-        <w:t>Lake Havasu City</w:t>
-      </w:r>
-      <w:r>
-        <w:rPr>
-          <w:sz w:val="20"/>
-        </w:rPr>
-        <w:t xml:space="preserve">, </w:t>
-      </w:r>
-      <w:r>
-        <w:rPr>
-          <w:sz w:val="20"/>
-        </w:rPr>
-        <w:t>A</w:t>
-      </w:r>
-      <w:r>
-        <w:rPr>
-          <w:sz w:val="20"/>
-        </w:rPr>
-        <w:t>Z</w:t>
-      </w:r>
-      <w:r>
-        <w:rPr>
-          <w:sz w:val="20"/>
-        </w:rPr>
-        <w:t xml:space="preserve">, </w:t>
-      </w:r>
-      <w:r>
-        <w:rPr>
-          <w:sz w:val="20"/>
-        </w:rPr>
-        <w:t>86404</w:t>
-      </w:r>
-      <w:r>
-        <w:rPr>
-          <w:sz w:val="20"/>
-        </w:rPr>
-        <w:tab/>
-      </w:r>
-      <w:r>
-        <w:rPr>
-          <w:sz w:val="20"/>
-        </w:rPr>
         <w:t xml:space="preserve">E-mail: </w:t>
       </w:r>
       <w:hyperlink r:id="rId7" w:history="1">
@@ -185,31 +80,7 @@
           <w:sz w:val="20"/>
         </w:rPr>
         <w:tab/>
-        <w:t>Web version</w:t>
-      </w:r>
-      <w:r>
-        <w:rPr>
-          <w:sz w:val="20"/>
-        </w:rPr>
-        <w:t xml:space="preserve"> of this</w:t>
-      </w:r>
-      <w:r>
-        <w:rPr>
-          <w:sz w:val="20"/>
-        </w:rPr>
-        <w:t xml:space="preserve"> </w:t>
-      </w:r>
-      <w:r>
-        <w:rPr>
-          <w:sz w:val="20"/>
-        </w:rPr>
-        <w:t>Résumé</w:t>
-      </w:r>
-      <w:r>
-        <w:rPr>
-          <w:sz w:val="20"/>
-        </w:rPr>
-        <w:t xml:space="preserve">: </w:t>
+        <w:t xml:space="preserve">Web version of this Résumé: </w:t>
       </w:r>
       <w:hyperlink r:id="rId8" w:history="1">
         <w:r>
@@ -331,49 +202,7 @@
         </w:rPr>
       </w:pPr>
       <w:r>
-        <w:t xml:space="preserve">Obtain a </w:t>
-      </w:r>
-      <w:r>
-        <w:t xml:space="preserve">position where my </w:t>
-      </w:r>
-      <w:r>
-        <w:t xml:space="preserve">Machine Learning/AI expertise, </w:t>
-      </w:r>
-      <w:r>
-        <w:t xml:space="preserve">advanced </w:t>
-      </w:r>
-      <w:r>
-        <w:t>signal processing</w:t>
-      </w:r>
-      <w:r>
-        <w:t xml:space="preserve"> </w:t>
-      </w:r>
-      <w:r>
-        <w:t>knowledge</w:t>
-      </w:r>
-      <w:r>
-        <w:t xml:space="preserve">, hands-on approach and managerial skills can be applied to the development and </w:t>
-      </w:r>
-      <w:r>
-        <w:t>deployment</w:t>
-      </w:r>
-      <w:r>
-        <w:t xml:space="preserve"> of new and innovative </w:t>
-      </w:r>
-      <w:r>
-        <w:t xml:space="preserve">technologies </w:t>
-      </w:r>
-      <w:r>
-        <w:t>and</w:t>
-      </w:r>
-      <w:r>
-        <w:t xml:space="preserve"> </w:t>
-      </w:r>
-      <w:r>
-        <w:t>products</w:t>
-      </w:r>
-      <w:r>
-        <w:t>.</w:t>
+        <w:t xml:space="preserve">Obtain a position where my Machine Learning/AI expertise, advanced signal processing knowledge, hands-on approach and managerial skills can be applied to the development and deployment of new and innovative technologies and products.</w:t>
       </w:r>
     </w:p>
     <w:p>
@@ -487,18 +316,7 @@
         </w:rPr>
       </w:pPr>
       <w:r>
-        <w:t>199</w:t>
-      </w:r>
-      <w:r>
-        <w:t>8</w:t>
-      </w:r>
-      <w:r>
-        <w:t xml:space="preserve"> – </w:t>
-      </w:r>
-      <w:r>
-        <w:t>2023</w:t>
-      </w:r>
-      <w:r>
+        <w:t xml:space="preserve">1998 – 2023</w:t>
         <w:tab/>
       </w:r>
       <w:r>
@@ -530,34 +348,14 @@
         <w:rPr>
           <w:u w:val="single"/>
         </w:rPr>
-        <w:t>AI/ML Research Scientist</w:t>
-      </w:r>
-      <w:r>
-        <w:rPr>
-          <w:u w:val="single"/>
-        </w:rPr>
-        <w:t xml:space="preserve"> (</w:t>
-      </w:r>
-      <w:r>
-        <w:rPr>
-          <w:i/>
-          <w:u w:val="single"/>
-        </w:rPr>
-        <w:t>2015</w:t>
-      </w:r>
-      <w:r>
-        <w:rPr>
-          <w:i/>
-          <w:u w:val="single"/>
-        </w:rPr>
-        <w:t>-</w:t>
-      </w:r>
-      <w:r>
-        <w:rPr>
-          <w:i/>
-          <w:u w:val="single"/>
-        </w:rPr>
-        <w:t>2023</w:t>
+        <w:t xml:space="preserve">AI/ML Research Scientist (</w:t>
+      </w:r>
+      <w:r>
+        <w:rPr>
+          <w:i/>
+          <w:u w:val="single"/>
+        </w:rPr>
+        <w:t>2015-2023</w:t>
       </w:r>
       <w:r>
         <w:rPr>
@@ -566,46 +364,7 @@
         <w:t>);</w:t>
       </w:r>
       <w:r>
-        <w:t xml:space="preserve"> Lead</w:t>
-      </w:r>
-      <w:r>
-        <w:t xml:space="preserve"> research in 1) e</w:t>
-      </w:r>
-      <w:r>
-        <w:t>nd-to-end Neural Networks for autonomous vehicle contro</w:t>
-      </w:r>
-      <w:r>
-        <w:t>ls, i.e., steering and throttle, 2) d</w:t>
-      </w:r>
-      <w:r>
-        <w:t>eveloping speech interfaces that use Deep Neural Networks to implement Natural Language Understanding and Automatic Speech Recognition</w:t>
-      </w:r>
-      <w:r>
-        <w:t xml:space="preserve">, 3) Sound Source Identifications and 4) </w:t>
-      </w:r>
-      <w:r>
-        <w:t>Sensors signal processing, e.g., LiDAR, cameras, etc.</w:t>
-      </w:r>
-      <w:r>
-        <w:t xml:space="preserve">  Also, participate</w:t>
-      </w:r>
-      <w:r>
-        <w:t>d</w:t>
-      </w:r>
-      <w:r>
-        <w:t xml:space="preserve"> in evaluations of</w:t>
-      </w:r>
-      <w:r>
-        <w:t xml:space="preserve"> strategic technologies from startups loc</w:t>
-      </w:r>
-      <w:r>
-        <w:t xml:space="preserve">ated in the Silicon Valley area and </w:t>
-      </w:r>
-      <w:r>
-        <w:t>supported</w:t>
-      </w:r>
-      <w:r>
-        <w:t xml:space="preserve"> recruiting efforts to build a strong team in a very competitive talent landscape.</w:t>
+        <w:t xml:space="preserve"> Lead research in 1) end-to-end Neural Networks for autonomous vehicle controls, i.e., steering and throttle, 2) developing speech interfaces that use Deep Neural Networks to implement Natural Language Understanding and Automatic Speech Recognition, 3) Sound Source Identifications and 4) Sensors signal processing, e.g., LiDAR, cameras, etc.  Also, participated in evaluations of strategic technologies from startups located in the Silicon Valley area and supported recruiting efforts to build a strong team in a very competitive talent landscape.</w:t>
       </w:r>
     </w:p>
     <w:p>
@@ -631,21 +390,7 @@
           <w:i/>
           <w:u w:val="single"/>
         </w:rPr>
-        <w:t>2012</w:t>
-      </w:r>
-      <w:r>
-        <w:rPr>
-          <w:i/>
-          <w:u w:val="single"/>
-        </w:rPr>
-        <w:t>-</w:t>
-      </w:r>
-      <w:r>
-        <w:rPr>
-          <w:i/>
-          <w:u w:val="single"/>
-        </w:rPr>
-        <w:t>2015</w:t>
+        <w:t>2012-2015</w:t>
       </w:r>
       <w:r>
         <w:rPr>
@@ -654,10 +399,7 @@
         <w:t>);</w:t>
       </w:r>
       <w:r>
-        <w:t xml:space="preserve"> </w:t>
-      </w:r>
-      <w:r>
-        <w:t xml:space="preserve">Team leader of the of the development and implementation of </w:t>
+        <w:t xml:space="preserve"> Team leader of the of the development and implementation of </w:t>
       </w:r>
       <w:r>
         <w:rPr>
@@ -701,42 +443,7 @@
         <w:t>P</w:t>
       </w:r>
       <w:r>
-        <w:t xml:space="preserve">rocedure (CETP) for hands-free speech quality processing of vehicle infotainment systems. The ability to do in-house evaluation of hands-free phone quality is a Ford first. This effort resulted in innovative hands-free noise reduction algorithm improvements for in-vehicle speech quality processing. Also, </w:t>
-      </w:r>
-      <w:proofErr w:type="gramStart"/>
-      <w:r>
-        <w:t>Lead</w:t>
-      </w:r>
-      <w:proofErr w:type="gramEnd"/>
-      <w:r>
-        <w:t xml:space="preserve"> d</w:t>
-      </w:r>
-      <w:r>
-        <w:t>eveloper of the Ford signal processing and advanced speech recognition toolbox (MATLAB based).  This toolbox contains multiple user interfaces</w:t>
-      </w:r>
-      <w:r>
-        <w:t xml:space="preserve"> </w:t>
-      </w:r>
-      <w:r>
-        <w:t xml:space="preserve">that allows to manage, </w:t>
-      </w:r>
-      <w:r>
-        <w:t>process,</w:t>
-      </w:r>
-      <w:r>
-        <w:t xml:space="preserve"> and create (1 patent) large number of speech utterances with various background noise levels and types to support the development of speech recognition algorithms and the testing of speech recognition engine.</w:t>
-      </w:r>
-      <w:r>
-        <w:t xml:space="preserve">  </w:t>
-      </w:r>
-      <w:r>
-        <w:t>Supported and analyzed all the suppliers’ noise suppression software evaluations and used the results to guide the speech processing selection for SYNC Gen III, i.e., QNX</w:t>
-      </w:r>
-      <w:r>
-        <w:t>.</w:t>
-      </w:r>
-      <w:r>
-        <w:t xml:space="preserve"> </w:t>
+        <w:t xml:space="preserve">rocedure (CETP) for hands-free speech quality processing of vehicle infotainment systems. The ability to do in-house evaluation of hands-free phone quality is a Ford first. This effort resulted in innovative hands-free noise reduction algorithm improvements for in-vehicle speech quality processing. Also, Lead developer of the Ford signal processing and advanced speech recognition toolbox (MATLAB based).  This toolbox contains multiple user interfaces that allows to manage, process, and create (1 patent) large number of speech utterances with various background noise levels and types to support the development of speech recognition algorithms and the testing of speech recognition engine.  Supported and analyzed all the suppliers’ noise suppression software evaluations and used the results to guide the speech processing selection for SYNC Gen III, i.e., QNX. </w:t>
       </w:r>
     </w:p>
     <w:p>
@@ -755,52 +462,14 @@
         <w:rPr>
           <w:u w:val="single"/>
         </w:rPr>
-        <w:t xml:space="preserve">S&amp;R </w:t>
-      </w:r>
-      <w:r>
-        <w:rPr>
-          <w:u w:val="single"/>
-        </w:rPr>
-        <w:t>C</w:t>
-      </w:r>
-      <w:r>
-        <w:rPr>
-          <w:u w:val="single"/>
-        </w:rPr>
-        <w:t xml:space="preserve">ore </w:t>
-      </w:r>
-      <w:r>
-        <w:rPr>
-          <w:u w:val="single"/>
-        </w:rPr>
-        <w:t xml:space="preserve">Engineer </w:t>
-      </w:r>
-      <w:r>
-        <w:rPr>
-          <w:u w:val="single"/>
-        </w:rPr>
-        <w:t>(</w:t>
-      </w:r>
-      <w:r>
-        <w:rPr>
-          <w:i/>
-          <w:u w:val="single"/>
-        </w:rPr>
-        <w:t>2009</w:t>
-      </w:r>
-      <w:r>
-        <w:rPr>
-          <w:i/>
-          <w:u w:val="single"/>
-        </w:rPr>
-        <w:t>-</w:t>
-      </w:r>
-      <w:r>
-        <w:rPr>
-          <w:i/>
-          <w:u w:val="single"/>
-        </w:rPr>
-        <w:t>2011</w:t>
+        <w:t xml:space="preserve">S&amp;R Core Engineer (</w:t>
+      </w:r>
+      <w:r>
+        <w:rPr>
+          <w:i/>
+          <w:u w:val="single"/>
+        </w:rPr>
+        <w:t>2009-2011</w:t>
       </w:r>
       <w:r>
         <w:rPr>
@@ -809,52 +478,7 @@
         <w:t>);</w:t>
       </w:r>
       <w:r>
-        <w:t xml:space="preserve"> Responsible</w:t>
-      </w:r>
-      <w:r>
-        <w:t xml:space="preserve"> for the development of innovative testing procedure</w:t>
-      </w:r>
-      <w:r>
-        <w:t>s</w:t>
-      </w:r>
-      <w:r>
-        <w:t>,</w:t>
-      </w:r>
-      <w:r>
-        <w:t xml:space="preserve"> </w:t>
-      </w:r>
-      <w:r>
-        <w:t xml:space="preserve">objective metrics, </w:t>
-      </w:r>
-      <w:r>
-        <w:t xml:space="preserve">data acquisition and processing, reporting, etc. </w:t>
-      </w:r>
-      <w:r>
-        <w:t>for</w:t>
-      </w:r>
-      <w:r>
-        <w:t xml:space="preserve"> a wide variety of core</w:t>
-      </w:r>
-      <w:r>
-        <w:t xml:space="preserve"> production</w:t>
-      </w:r>
-      <w:r>
-        <w:t xml:space="preserve"> pro</w:t>
-      </w:r>
-      <w:r>
-        <w:t>gram</w:t>
-      </w:r>
-      <w:r>
-        <w:t>s</w:t>
-      </w:r>
-      <w:r>
-        <w:t>.</w:t>
-      </w:r>
-      <w:r>
-        <w:t xml:space="preserve">  </w:t>
-      </w:r>
-      <w:r>
-        <w:t>Develops and/or adapts objective metrics, methods, and tools for the various requirements of the projects. Performs both road and lab measurements using proving ground and the Hydraulic Road Simulator.</w:t>
+        <w:t xml:space="preserve"> Responsible for the development of innovative testing procedures, objective metrics, data acquisition and processing, reporting, etc. for a wide variety of core production programs.  Develops and/or adapts objective metrics, methods, and tools for the various requirements of the projects. Performs both road and lab measurements using proving ground and the Hydraulic Road Simulator.</w:t>
       </w:r>
     </w:p>
     <w:p>
@@ -889,10 +513,7 @@
         <w:t>);</w:t>
       </w:r>
       <w:r>
-        <w:t xml:space="preserve"> </w:t>
-      </w:r>
-      <w:r>
-        <w:t xml:space="preserve">Principal developer for the </w:t>
+        <w:t xml:space="preserve"> Principal developer for the </w:t>
       </w:r>
       <w:r>
         <w:rPr>
@@ -936,73 +557,7 @@
         <w:t>C</w:t>
       </w:r>
       <w:r>
-        <w:t xml:space="preserve">hart </w:t>
-      </w:r>
-      <w:r>
-        <w:t xml:space="preserve">tools and </w:t>
-      </w:r>
-      <w:r>
-        <w:t xml:space="preserve">infrastructure.  </w:t>
-      </w:r>
-      <w:r>
-        <w:t xml:space="preserve">Created </w:t>
-      </w:r>
-      <w:r>
-        <w:t xml:space="preserve">the first comprehensive implementation of </w:t>
-      </w:r>
-      <w:r>
-        <w:t>VS</w:t>
-      </w:r>
-      <w:r>
-        <w:t>HC</w:t>
-      </w:r>
-      <w:r>
-        <w:t xml:space="preserve"> data management, processing and reporting</w:t>
-      </w:r>
-      <w:r>
-        <w:t xml:space="preserve"> system</w:t>
-      </w:r>
-      <w:r>
-        <w:t xml:space="preserve"> that </w:t>
-      </w:r>
-      <w:r>
-        <w:t>r</w:t>
-      </w:r>
-      <w:r>
-        <w:t>educe</w:t>
-      </w:r>
-      <w:r>
-        <w:t>s</w:t>
-      </w:r>
-      <w:r>
-        <w:t xml:space="preserve"> t</w:t>
-      </w:r>
-      <w:r>
-        <w:t>he</w:t>
-      </w:r>
-      <w:r>
-        <w:t xml:space="preserve"> amount of time to </w:t>
-      </w:r>
-      <w:r>
-        <w:t>process</w:t>
-      </w:r>
-      <w:r>
-        <w:t xml:space="preserve"> full </w:t>
-      </w:r>
-      <w:r>
-        <w:t>VS</w:t>
-      </w:r>
-      <w:r>
-        <w:t>HC</w:t>
-      </w:r>
-      <w:r>
-        <w:t xml:space="preserve"> data from days to </w:t>
-      </w:r>
-      <w:r>
-        <w:t>minutes</w:t>
-      </w:r>
-      <w:r>
-        <w:t>.</w:t>
+        <w:t xml:space="preserve">hart tools and infrastructure.  Created the first comprehensive implementation of VSHC data management, processing and reporting system that reduces the amount of time to process full VSHC data from days to minutes.</w:t>
       </w:r>
     </w:p>
     <w:p>
@@ -1021,13 +576,7 @@
         <w:rPr>
           <w:u w:val="single"/>
         </w:rPr>
-        <w:t>Closures Lab Leader</w:t>
-      </w:r>
-      <w:r>
-        <w:rPr>
-          <w:u w:val="single"/>
-        </w:rPr>
-        <w:t xml:space="preserve"> (</w:t>
+        <w:t xml:space="preserve">Closures Lab Leader (</w:t>
       </w:r>
       <w:r>
         <w:rPr>
@@ -1040,51 +589,10 @@
         <w:rPr>
           <w:u w:val="single"/>
         </w:rPr>
-        <w:t>)</w:t>
-      </w:r>
-      <w:r>
-        <w:rPr>
-          <w:u w:val="single"/>
-        </w:rPr>
-        <w:t>;</w:t>
-      </w:r>
-      <w:r>
-        <w:t xml:space="preserve"> Plan, schedule, process data and </w:t>
-      </w:r>
-      <w:r>
-        <w:t>adapt</w:t>
-      </w:r>
-      <w:r>
-        <w:t xml:space="preserve">, if needed, all the </w:t>
-      </w:r>
-      <w:r>
-        <w:t xml:space="preserve">signal processing/ metrics required for </w:t>
-      </w:r>
-      <w:r>
-        <w:t xml:space="preserve">noise and vibration measurements done at the </w:t>
-      </w:r>
-      <w:r>
-        <w:t>closure’s</w:t>
-      </w:r>
-      <w:r>
-        <w:t xml:space="preserve"> lab</w:t>
-      </w:r>
-      <w:r>
-        <w:t>.</w:t>
-      </w:r>
-      <w:r>
-        <w:t xml:space="preserve">  </w:t>
-      </w:r>
-      <w:r>
-        <w:t xml:space="preserve">These include in-vehicle microphones and accelerometers </w:t>
-      </w:r>
-      <w:proofErr w:type="gramStart"/>
-      <w:r>
-        <w:t>instrumentation</w:t>
-      </w:r>
-      <w:proofErr w:type="gramEnd"/>
-      <w:r>
-        <w:t xml:space="preserve"> and measurement made on several harsh road surfaces at various speeds.</w:t>
+        <w:t>);</w:t>
+      </w:r>
+      <w:r>
+        <w:t xml:space="preserve"> Plan, schedule, process data and adapt, if needed, all the signal processing/ metrics required for noise and vibration measurements done at the closure’s lab.  These include in-vehicle microphones and accelerometers instrumentation and measurement made on several harsh road surfaces at various speeds.</w:t>
       </w:r>
     </w:p>
     <w:p>
@@ -1106,31 +614,7 @@
         <w:rPr>
           <w:u w:val="single"/>
         </w:rPr>
-        <w:t>S</w:t>
-      </w:r>
-      <w:r>
-        <w:rPr>
-          <w:u w:val="single"/>
-        </w:rPr>
-        <w:t xml:space="preserve">ound </w:t>
-      </w:r>
-      <w:r>
-        <w:rPr>
-          <w:u w:val="single"/>
-        </w:rPr>
-        <w:t>Q</w:t>
-      </w:r>
-      <w:r>
-        <w:rPr>
-          <w:u w:val="single"/>
-        </w:rPr>
-        <w:t>uality</w:t>
-      </w:r>
-      <w:r>
-        <w:rPr>
-          <w:u w:val="single"/>
-        </w:rPr>
-        <w:t xml:space="preserve"> Lab Leader (</w:t>
+        <w:t xml:space="preserve">Sound Quality Lab Leader (</w:t>
       </w:r>
       <w:r>
         <w:rPr>
@@ -1182,37 +666,7 @@
         <w:t>P</w:t>
       </w:r>
       <w:r>
-        <w:t>rocedures (</w:t>
-      </w:r>
-      <w:r>
-        <w:t>CETP)</w:t>
-      </w:r>
-      <w:r>
-        <w:t xml:space="preserve">, </w:t>
-      </w:r>
-      <w:r>
-        <w:t xml:space="preserve">data </w:t>
-      </w:r>
-      <w:r>
-        <w:t>processing/</w:t>
-      </w:r>
-      <w:r>
-        <w:t xml:space="preserve">acquisition, </w:t>
-      </w:r>
-      <w:r>
-        <w:t>archiving</w:t>
-      </w:r>
-      <w:r>
-        <w:t xml:space="preserve">, and </w:t>
-      </w:r>
-      <w:r>
-        <w:t xml:space="preserve">management. </w:t>
-      </w:r>
-      <w:r>
-        <w:t xml:space="preserve"> P</w:t>
-      </w:r>
-      <w:r>
-        <w:t>roactively created batch processing software to reduce the time required to process data which reduced the lab turnaround time by at least a factor of five.</w:t>
+        <w:t xml:space="preserve">rocedures (CETP), data processing/acquisition, archiving, and management.  Proactively created batch processing software to reduce the time required to process data which reduced the lab turnaround time by at least a factor of five.</w:t>
       </w:r>
     </w:p>
     <w:p>
@@ -1231,19 +685,7 @@
         <w:rPr>
           <w:u w:val="single"/>
         </w:rPr>
-        <w:t>NOMAD Te</w:t>
-      </w:r>
-      <w:r>
-        <w:rPr>
-          <w:u w:val="single"/>
-        </w:rPr>
-        <w:t xml:space="preserve">am </w:t>
-      </w:r>
-      <w:r>
-        <w:rPr>
-          <w:u w:val="single"/>
-        </w:rPr>
-        <w:t>Leader (</w:t>
+        <w:t xml:space="preserve">NOMAD Team Leader (</w:t>
       </w:r>
       <w:r>
         <w:rPr>
@@ -1259,10 +701,7 @@
         <w:t>);</w:t>
       </w:r>
       <w:r>
-        <w:t xml:space="preserve"> Led</w:t>
-      </w:r>
-      <w:r>
-        <w:t xml:space="preserve"> the development and implementation of assembly plant end of line acoustic and vibration analysis/tools/software for </w:t>
+        <w:t xml:space="preserve"> Led the development and implementation of assembly plant end of line acoustic and vibration analysis/tools/software for </w:t>
       </w:r>
       <w:r>
         <w:rPr>
@@ -1333,21 +772,7 @@
           <w:i/>
           <w:u w:val="single"/>
         </w:rPr>
-        <w:t>1999</w:t>
-      </w:r>
-      <w:r>
-        <w:rPr>
-          <w:i/>
-          <w:u w:val="single"/>
-        </w:rPr>
-        <w:t>-</w:t>
-      </w:r>
-      <w:r>
-        <w:rPr>
-          <w:i/>
-          <w:u w:val="single"/>
-        </w:rPr>
-        <w:t>2001</w:t>
+        <w:t>1999-2001</w:t>
       </w:r>
       <w:r>
         <w:rPr>
@@ -1356,22 +781,7 @@
         <w:t>);</w:t>
       </w:r>
       <w:r>
-        <w:t xml:space="preserve"> </w:t>
-      </w:r>
-      <w:r>
-        <w:t>Principal technical develo</w:t>
-      </w:r>
-      <w:r>
-        <w:t xml:space="preserve">per for various NVH/S&amp;R tools. </w:t>
-      </w:r>
-      <w:r>
-        <w:t>Received the prestigious “HENRY FORD TECHNOLOGICAL AWARD” for all the technical contributions in the development of these tools (</w:t>
-      </w:r>
-      <w:r>
-        <w:t>4</w:t>
-      </w:r>
-      <w:r>
-        <w:t xml:space="preserve"> patents + CETP).</w:t>
+        <w:t xml:space="preserve"> Principal technical developer for various NVH/S&amp;R tools. Received the prestigious “HENRY FORD TECHNOLOGICAL AWARD” for all the technical contributions in the development of these tools (4 patents + CETP).</w:t>
       </w:r>
     </w:p>
     <w:p>
@@ -1433,15 +843,7 @@
         <w:t>R</w:t>
       </w:r>
       <w:r>
-        <w:t xml:space="preserve">attle (i.e., BSR) measurements and diagnostics on multiple vehicle programs e.g., sliding wedge rattle, window scrape, side doors, lift gates, door chuck, etc.  </w:t>
-      </w:r>
-      <w:r>
-        <w:t>Developed and implemented new embedded systems/tools for detection and localization of S&amp;R sources, i.e., the “S&amp;R Exciter kit” and the S&amp;R failure detection/prediction of stabilizer bar bushing, (2 patents)</w:t>
-      </w:r>
-      <w:r>
-        <w:t>.</w:t>
-      </w:r>
-      <w:r>
+        <w:t xml:space="preserve">attle (i.e., BSR) measurements and diagnostics on multiple vehicle programs e.g., sliding wedge rattle, window scrape, side doors, lift gates, door chuck, etc.  Developed and implemented new embedded systems/tools for detection and localization of S&amp;R sources, i.e., the “S&amp;R Exciter kit” and the S&amp;R failure detection/prediction of stabilizer bar bushing, (2 patents).</w:t>
         <w:br w:type="page"/>
       </w:r>
     </w:p>
@@ -1561,21 +963,7 @@
           <w:b/>
           <w:bCs/>
         </w:rPr>
-        <w:t>Research Associate – Post Doctoral Work</w:t>
-      </w:r>
-      <w:r>
-        <w:rPr>
-          <w:b/>
-          <w:bCs/>
-        </w:rPr>
-        <w:t xml:space="preserve"> in Active Control of Sound</w:t>
-      </w:r>
-      <w:r>
-        <w:rPr>
-          <w:b/>
-          <w:bCs/>
-        </w:rPr>
-        <w:t xml:space="preserve"> and vibrations</w:t>
+        <w:t xml:space="preserve">Research Associate – Post Doctoral Work in Active Control of Sound and vibrations</w:t>
       </w:r>
     </w:p>
     <w:p>
@@ -1591,8 +979,6 @@
       </w:pPr>
       <w:r>
         <w:t>1996 – 1998</w:t>
-      </w:r>
-      <w:r>
         <w:tab/>
       </w:r>
       <w:r>
@@ -1659,10 +1045,7 @@
         <w:t>3)</w:t>
       </w:r>
       <w:r>
-        <w:t xml:space="preserve"> </w:t>
-      </w:r>
-      <w:r>
-        <w:t xml:space="preserve">Led the signal processing development for the noise source separation and identification system in motor vehicles cabin using the Least Mean Square (i.e., LMS) algorithm. </w:t>
+        <w:t xml:space="preserve"> Led the signal processing development for the noise source separation and identification system in motor vehicles cabin using the Least Mean Square (i.e., LMS) algorithm. </w:t>
       </w:r>
       <w:r>
         <w:rPr>
@@ -1672,10 +1055,7 @@
         <w:t>4)</w:t>
       </w:r>
       <w:r>
-        <w:t xml:space="preserve"> </w:t>
-      </w:r>
-      <w:r>
-        <w:t>Developed electro-mechanical adaptive vibration absorbers for sound minimization applications. Designed and implemented two different types of tunable vibration absorbers.  Planned and executed the numerous lab experiments required to verify and improve these new tunable vibration absorbers.  Demonstrated that the greatest sound reduction obtained with a vibration absorber is not necessarily when the absorber is tuned to minimize the vibration.  The greatest reduction is obtained using an acoustic cost function which leads to the absorber being detuned.</w:t>
+        <w:t xml:space="preserve"> Developed electro-mechanical adaptive vibration absorbers for sound minimization applications. Designed and implemented two different types of tunable vibration absorbers.  Planned and executed the numerous lab experiments required to verify and improve these new tunable vibration absorbers.  Demonstrated that the greatest sound reduction obtained with a vibration absorber is not necessarily when the absorber is tuned to minimize the vibration.  The greatest reduction is obtained using an acoustic cost function which leads to the absorber being detuned.</w:t>
       </w:r>
     </w:p>
     <w:p>
@@ -1711,8 +1091,6 @@
       </w:pPr>
       <w:r>
         <w:t>1992 – 1995</w:t>
-      </w:r>
-      <w:r>
         <w:tab/>
       </w:r>
       <w:r>
@@ -1776,7 +1154,6 @@
           <w:sz w:val="20"/>
         </w:rPr>
       </w:pPr>
-      <w:proofErr w:type="gramStart"/>
       <w:r>
         <w:rPr>
           <w:b/>
@@ -1784,7 +1161,6 @@
         </w:rPr>
         <w:t>Master in Mechanical Engineering</w:t>
       </w:r>
-      <w:proofErr w:type="gramEnd"/>
     </w:p>
     <w:p>
       <w:pPr>
@@ -1799,8 +1175,6 @@
       </w:pPr>
       <w:r>
         <w:t>1990 – 1992</w:t>
-      </w:r>
-      <w:r>
         <w:tab/>
       </w:r>
       <w:r>
@@ -1813,13 +1187,7 @@
       </w:r>
       <w:r>
         <w:tab/>
-        <w:t>Qu</w:t>
-      </w:r>
-      <w:r>
-        <w:t>é</w:t>
-      </w:r>
-      <w:r>
-        <w:t>bec, QC, Canada</w:t>
+        <w:t>Québec, QC, Canada</w:t>
       </w:r>
     </w:p>
     <w:p>
@@ -1870,7 +1238,6 @@
           <w:sz w:val="20"/>
         </w:rPr>
       </w:pPr>
-      <w:proofErr w:type="gramStart"/>
       <w:r>
         <w:rPr>
           <w:b/>
@@ -1878,7 +1245,6 @@
         </w:rPr>
         <w:t>Bachelor in Mechanical Engineering</w:t>
       </w:r>
-      <w:proofErr w:type="gramEnd"/>
     </w:p>
     <w:p>
       <w:pPr>
@@ -1893,8 +1259,6 @@
       </w:pPr>
       <w:r>
         <w:t>1985 – 1990</w:t>
-      </w:r>
-      <w:r>
         <w:tab/>
       </w:r>
       <w:r>
@@ -1907,13 +1271,7 @@
       </w:r>
       <w:r>
         <w:tab/>
-        <w:t>Qu</w:t>
-      </w:r>
-      <w:r>
-        <w:t>é</w:t>
-      </w:r>
-      <w:r>
-        <w:t>bec, QC, Canada</w:t>
+        <w:t>Québec, QC, Canada</w:t>
       </w:r>
     </w:p>
     <w:p>
@@ -2032,8 +1390,6 @@
       </w:r>
       <w:r>
         <w:tab/>
-      </w:r>
-      <w:r>
         <w:t xml:space="preserve">2010 </w:t>
       </w:r>
       <w:r>
@@ -2069,8 +1425,6 @@
       </w:r>
       <w:r>
         <w:tab/>
-      </w:r>
-      <w:r>
         <w:t xml:space="preserve">2009 </w:t>
       </w:r>
       <w:r>
@@ -2078,11 +1432,6 @@
           <w:i/>
         </w:rPr>
         <w:t>VE Quality Award</w:t>
-      </w:r>
-      <w:r>
-        <w:rPr>
-          <w:i/>
-        </w:rPr>
         <w:tab/>
       </w:r>
     </w:p>
@@ -2105,8 +1454,6 @@
       </w:r>
       <w:r>
         <w:tab/>
-      </w:r>
-      <w:r>
         <w:t xml:space="preserve">2007 </w:t>
       </w:r>
       <w:r>
@@ -2139,8 +1486,6 @@
       </w:r>
       <w:r>
         <w:tab/>
-      </w:r>
-      <w:r>
         <w:t xml:space="preserve">2005 </w:t>
       </w:r>
       <w:r>
@@ -2163,13 +1508,7 @@
         <w:jc w:val="both"/>
       </w:pPr>
       <w:r>
-        <w:t>201</w:t>
-      </w:r>
-      <w:r>
-        <w:t>8</w:t>
-      </w:r>
-      <w:r>
-        <w:t xml:space="preserve"> </w:t>
+        <w:t xml:space="preserve">2018 </w:t>
       </w:r>
       <w:r>
         <w:rPr>
@@ -2179,8 +1518,6 @@
       </w:r>
       <w:r>
         <w:tab/>
-      </w:r>
-      <w:r>
         <w:t xml:space="preserve">2002 </w:t>
       </w:r>
       <w:r>
@@ -2212,8 +1549,6 @@
       </w:r>
       <w:r>
         <w:tab/>
-      </w:r>
-      <w:r>
         <w:t xml:space="preserve">1999 </w:t>
       </w:r>
       <w:r>
@@ -2249,23 +1584,13 @@
       </w:r>
       <w:r>
         <w:tab/>
-      </w:r>
-      <w:r>
-        <w:t>1</w:t>
-      </w:r>
-      <w:r>
-        <w:t xml:space="preserve">994-1995 </w:t>
+        <w:t xml:space="preserve">1994-1995 </w:t>
       </w:r>
       <w:r>
         <w:rPr>
           <w:i/>
         </w:rPr>
         <w:t>FCAR Scholarship</w:t>
-      </w:r>
-      <w:r>
-        <w:rPr>
-          <w:i/>
-        </w:rPr>
         <w:tab/>
       </w:r>
     </w:p>
@@ -2288,8 +1613,6 @@
       </w:r>
       <w:r>
         <w:tab/>
-      </w:r>
-      <w:r>
         <w:t xml:space="preserve">1993 </w:t>
       </w:r>
       <w:r>
@@ -2318,11 +1641,6 @@
           <w:i/>
         </w:rPr>
         <w:t>PD Engineering Excellence Award</w:t>
-      </w:r>
-      <w:r>
-        <w:rPr>
-          <w:i/>
-        </w:rPr>
         <w:tab/>
       </w:r>
       <w:r>
@@ -2453,15 +1771,7 @@
         <w:t>U.S. citizen</w:t>
       </w:r>
       <w:r>
-        <w:t>, bilingual (</w:t>
-      </w:r>
-      <w:proofErr w:type="gramStart"/>
-      <w:r>
-        <w:t>English-French</w:t>
-      </w:r>
-      <w:proofErr w:type="gramEnd"/>
-      <w:r>
-        <w:t>).</w:t>
+        <w:t>, bilingual (English-French).</w:t>
       </w:r>
     </w:p>
     <w:p>
@@ -2477,34 +1787,7 @@
         <w:jc w:val="both"/>
       </w:pPr>
       <w:r>
-        <w:t>Expert in</w:t>
-      </w:r>
-      <w:r>
-        <w:t xml:space="preserve"> program</w:t>
-      </w:r>
-      <w:r>
-        <w:t>ming</w:t>
-      </w:r>
-      <w:r>
-        <w:t xml:space="preserve"> </w:t>
-      </w:r>
-      <w:r>
-        <w:t>Python,</w:t>
-      </w:r>
-      <w:r>
-        <w:t xml:space="preserve"> </w:t>
-      </w:r>
-      <w:r>
-        <w:t>MATLAB,</w:t>
-      </w:r>
-      <w:r>
-        <w:t xml:space="preserve"> </w:t>
-      </w:r>
-      <w:r>
-        <w:t>and LabVIEW</w:t>
-      </w:r>
-      <w:r>
-        <w:t>.</w:t>
+        <w:t xml:space="preserve">Expert in programming Python, MATLAB, and LabVIEW.</w:t>
       </w:r>
     </w:p>
     <w:p>
@@ -2520,16 +1803,7 @@
         <w:jc w:val="both"/>
       </w:pPr>
       <w:r>
-        <w:t>Experienced with various DNN frameworks; TensorFlow</w:t>
-      </w:r>
-      <w:r>
-        <w:t xml:space="preserve"> with Keras and </w:t>
-      </w:r>
-      <w:r>
-        <w:t>PyTorch</w:t>
-      </w:r>
-      <w:r>
-        <w:t>.</w:t>
+        <w:t xml:space="preserve">Experienced with various DNN frameworks; TensorFlow with Keras and PyTorch.</w:t>
       </w:r>
     </w:p>
     <w:p>
@@ -2545,52 +1819,7 @@
         <w:jc w:val="both"/>
       </w:pPr>
       <w:r>
-        <w:t xml:space="preserve">Proficient user of various </w:t>
-      </w:r>
-      <w:r>
-        <w:t>data acquisition</w:t>
-      </w:r>
-      <w:r>
-        <w:t xml:space="preserve"> and </w:t>
-      </w:r>
-      <w:r>
-        <w:t xml:space="preserve">analysis systems, e.g., </w:t>
-      </w:r>
-      <w:r>
-        <w:t xml:space="preserve">LMS </w:t>
-      </w:r>
-      <w:proofErr w:type="spellStart"/>
-      <w:r>
-        <w:t>TestLab</w:t>
-      </w:r>
-      <w:proofErr w:type="spellEnd"/>
-      <w:r>
-        <w:t>, Head Acoustics (ACQUA and Artemis)</w:t>
-      </w:r>
-      <w:r>
-        <w:t>, National Instruments systems</w:t>
-      </w:r>
-      <w:r>
-        <w:t>,</w:t>
-      </w:r>
-      <w:r>
-        <w:t xml:space="preserve"> B&amp;K Equipment, </w:t>
-      </w:r>
-      <w:proofErr w:type="spellStart"/>
-      <w:r>
-        <w:t>Iotech</w:t>
-      </w:r>
-      <w:proofErr w:type="spellEnd"/>
-      <w:r>
-        <w:t xml:space="preserve"> </w:t>
-      </w:r>
-      <w:proofErr w:type="spellStart"/>
-      <w:r>
-        <w:t>Wavebook</w:t>
-      </w:r>
-      <w:proofErr w:type="spellEnd"/>
-      <w:r>
-        <w:t>, HP analyzers, etc.</w:t>
+        <w:t xml:space="preserve">Proficient user of various data acquisition and analysis systems, e.g., LMS TestLab, Head Acoustics (ACQUA and Artemis), National Instruments systems, B&amp;K Equipment, Iotech Wavebook, HP analyzers, etc.</w:t>
       </w:r>
     </w:p>
     <w:p>
@@ -2695,70 +1924,7 @@
         <w:jc w:val="both"/>
       </w:pPr>
       <w:r>
-        <w:t>20</w:t>
-      </w:r>
-      <w:r>
-        <w:t xml:space="preserve"> US Patents</w:t>
-      </w:r>
-      <w:r>
-        <w:t xml:space="preserve"> (plus </w:t>
-      </w:r>
-      <w:r>
-        <w:t>5</w:t>
-      </w:r>
-      <w:r>
-        <w:t xml:space="preserve"> others pending)</w:t>
-      </w:r>
-      <w:r>
-        <w:t xml:space="preserve">, </w:t>
-      </w:r>
-      <w:r>
-        <w:t>16</w:t>
-      </w:r>
-      <w:r>
-        <w:t xml:space="preserve"> articles/</w:t>
-      </w:r>
-      <w:r>
-        <w:t>preprints</w:t>
-      </w:r>
-      <w:r>
-        <w:t xml:space="preserve">, </w:t>
-      </w:r>
-      <w:r>
-        <w:t>20</w:t>
-      </w:r>
-      <w:r>
-        <w:t xml:space="preserve"> Tech. Reports, </w:t>
-      </w:r>
-      <w:r>
-        <w:t xml:space="preserve">24 Conferences, </w:t>
-      </w:r>
-      <w:r>
-        <w:t>1</w:t>
-      </w:r>
-      <w:r>
-        <w:t>1</w:t>
-      </w:r>
-      <w:r>
-        <w:t xml:space="preserve"> </w:t>
-      </w:r>
-      <w:r>
-        <w:t>workshops</w:t>
-      </w:r>
-      <w:r>
-        <w:t xml:space="preserve"> and </w:t>
-      </w:r>
-      <w:r>
-        <w:t>10</w:t>
-      </w:r>
-      <w:r>
-        <w:t>0 + internal</w:t>
-      </w:r>
-      <w:r>
-        <w:t xml:space="preserve"> </w:t>
-      </w:r>
-      <w:r>
-        <w:t>departmental reports and test procedures.</w:t>
+        <w:t xml:space="preserve">29 US Patents, 16 articles/preprints, 20 Tech. Reports, 24 Conferences, 11 workshops and 100 + internal departmental reports and test procedures.</w:t>
       </w:r>
     </w:p>
     <w:sectPr>

</xml_diff>

<commit_message>
Remove home address and mobile from the resume; refresh the objective
These files are downloadable by anyone from the site, so the street
address and mobile number were as public as anything on the page itself
-- and the phone had already been taken off both sites. The header now
carries city and state, email, and the link to the web version.

The objective still said "Obtain a position", which contradicted the
site's framing. It now matches: open to select consulting, advisory and
research engagements, retired from Ford in 2023, currently at Charette
AI Group.

Word and PDF regenerated together; schema validation passes at 47
paragraphs (one fewer, the deleted header line), the PDF is still two
pages, and the rendered pages were checked to confirm the header closed
up cleanly rather than leaving a gap.

Co-Authored-By: Claude Opus 5 <noreply@anthropic.com>
</commit_message>
<xml_diff>
--- a/pubs/FrancoisCharettePhD_Resume.docx
+++ b/pubs/FrancoisCharettePhD_Resume.docx
@@ -26,33 +26,13 @@
         </w:tabs>
         <w:rPr>
           <w:sz w:val="20"/>
-          <w:lang w:val="fr-CA"/>
         </w:rPr>
       </w:pPr>
       <w:r>
         <w:rPr>
           <w:sz w:val="20"/>
-          <w:lang w:val="fr-CA"/>
-        </w:rPr>
-        <w:t>849 Avalon Avenue</w:t>
-        <w:tab/>
-        <w:t xml:space="preserve">Mobile: (209) 972-1220</w:t>
-      </w:r>
-    </w:p>
-    <w:p>
-      <w:pPr>
-        <w:tabs>
-          <w:tab w:val="right" w:pos="11070"/>
-        </w:tabs>
-        <w:rPr>
-          <w:sz w:val="20"/>
-        </w:rPr>
-      </w:pPr>
-      <w:r>
-        <w:rPr>
-          <w:sz w:val="20"/>
-        </w:rPr>
-        <w:t xml:space="preserve">Lake Havasu City, AZ, 86404</w:t>
+        </w:rPr>
+        <w:t xml:space="preserve">Lake Havasu City, AZ</w:t>
         <w:tab/>
         <w:t xml:space="preserve">E-mail: </w:t>
       </w:r>
@@ -202,7 +182,7 @@
         </w:rPr>
       </w:pPr>
       <w:r>
-        <w:t xml:space="preserve">Obtain a position where my Machine Learning/AI expertise, advanced signal processing knowledge, hands-on approach and managerial skills can be applied to the development and deployment of new and innovative technologies and products.</w:t>
+        <w:t xml:space="preserve">Apply my Machine Learning/AI expertise, advanced signal processing knowledge and hands-on approach to select consulting, advisory and research engagements. Retired from Ford in 2023, I now research and build AI, Machine Learning and signal processing applications at Charette AI Group.</w:t>
       </w:r>
     </w:p>
     <w:p>

</xml_diff>